<commit_message>
feat: add tests, complete UML diagrams, expand annotation doc
- tests/: 21 pytest cases covering auth (8), community (9), upload (4),
  all passing; conftest.py uses in-memory SQLite test DB
- docs/uml.md: add User/Post/Comment class diagram, full ER diagram,
  three sequence diagrams (register, @AI reply, resource review flow)
- 注释提取文档.docx: add ch11 auth.py, ch12 upload.py,
  ch13 CommunityPage.tsx, ch14 PostDetailPage.tsx

Co-Authored-By: Claude Sonnet 4.6 <noreply@anthropic.com>
</commit_message>
<xml_diff>
--- a/注释提取文档.docx
+++ b/注释提取文档.docx
@@ -6172,6 +6172,417 @@
         <w:t>说明：APScheduler 每5分钟额外扫描 needs_ai=True 且 ai_answered=False 的帖子，作为兜底触发机制。</w:t>
       </w:r>
     </w:p>
+    <w:p>
+      <w:pPr>
+        <w:pStyle w:val="Heading1"/>
+      </w:pPr>
+      <w:r>
+        <w:rPr>
+          <w:rFonts w:ascii="微软雅黑" w:hAnsi="微软雅黑"/>
+          <w:b/>
+          <w:color w:val="1F3864"/>
+          <w:sz w:val="32"/>
+        </w:rPr>
+        <w:t>十一、用户认证接口（auth.py）</w:t>
+      </w:r>
+    </w:p>
+    <w:p>
+      <w:r>
+        <w:rPr>
+          <w:rFonts w:ascii="微软雅黑" w:hAnsi="微软雅黑"/>
+          <w:sz w:val="20"/>
+        </w:rPr>
+        <w:t>提供注册、登录、邮箱验证码发送、密码重置、获取当前用户信息共6个端点。所有写操作使用 SQLAlchemy Session 依赖注入，Token 相关操作使用 JWT（HS256）。</w:t>
+      </w:r>
+    </w:p>
+    <w:p>
+      <w:pPr>
+        <w:pStyle w:val="Heading2"/>
+      </w:pPr>
+      <w:r>
+        <w:rPr>
+          <w:rFonts w:ascii="微软雅黑" w:hAnsi="微软雅黑"/>
+          <w:b/>
+          <w:color w:val="2E75B6"/>
+          <w:sz w:val="26"/>
+        </w:rPr>
+        <w:t>端点列表</w:t>
+      </w:r>
+    </w:p>
+    <w:p>
+      <w:pPr>
+        <w:ind w:left="240"/>
+        <w:shd w:val="clear" w:color="auto" w:fill="F2F2F2"/>
+      </w:pPr>
+      <w:r>
+        <w:rPr>
+          <w:rFonts w:ascii="Courier New" w:hAnsi="Courier New"/>
+          <w:sz w:val="18"/>
+        </w:rPr>
+        <w:t>POST /api/auth/send-code       发送注册验证码，60秒内不可重复发送，验证码内存缓存TTL=10分钟</w:t>
+        <w:br/>
+        <w:t>POST /api/auth/register        验证码校验→用户名/邮箱唯一性校验→bcrypt哈希密码→INSERT→返回JWT</w:t>
+        <w:br/>
+        <w:t>POST /api/auth/login           支持用户名或邮箱登录，bcrypt比对密码，返回JWT</w:t>
+        <w:br/>
+        <w:t>POST /api/auth/send-reset-code 重置密码验证码，邮箱不存在时统一返回成功（不暴露邮箱是否注册）</w:t>
+        <w:br/>
+        <w:t>POST /api/auth/reset-password  验证码校验→更新 hashed_password</w:t>
+        <w:br/>
+        <w:t>GET  /api/auth/me              返回当前登录用户信息（需Bearer Token）</w:t>
+      </w:r>
+    </w:p>
+    <w:p>
+      <w:pPr>
+        <w:pStyle w:val="Heading2"/>
+      </w:pPr>
+      <w:r>
+        <w:rPr>
+          <w:rFonts w:ascii="微软雅黑" w:hAnsi="微软雅黑"/>
+          <w:b/>
+          <w:color w:val="2E75B6"/>
+          <w:sz w:val="26"/>
+        </w:rPr>
+        <w:t>安全设计</w:t>
+      </w:r>
+    </w:p>
+    <w:p>
+      <w:r>
+        <w:rPr>
+          <w:rFonts w:ascii="微软雅黑" w:hAnsi="微软雅黑"/>
+          <w:sz w:val="20"/>
+        </w:rPr>
+        <w:t>1. 密码使用 bcrypt 单向哈希存储，不可逆，不明文保存。</w:t>
+      </w:r>
+    </w:p>
+    <w:p>
+      <w:r>
+        <w:rPr>
+          <w:rFonts w:ascii="微软雅黑" w:hAnsi="微软雅黑"/>
+          <w:sz w:val="20"/>
+        </w:rPr>
+        <w:t>2. JWT 有效期7天，SECRET_KEY 从 .env 读取，不硬编码在代码里。</w:t>
+      </w:r>
+    </w:p>
+    <w:p>
+      <w:r>
+        <w:rPr>
+          <w:rFonts w:ascii="微软雅黑" w:hAnsi="微软雅黑"/>
+          <w:sz w:val="20"/>
+        </w:rPr>
+        <w:t>3. 重置密码端点不暴露邮箱是否存在，防止用户枚举攻击。</w:t>
+      </w:r>
+    </w:p>
+    <w:p>
+      <w:pPr>
+        <w:shd w:val="clear" w:color="auto" w:fill="EBF3FB"/>
+      </w:pPr>
+      <w:r>
+        <w:rPr>
+          <w:rFonts w:ascii="微软雅黑" w:hAnsi="微软雅黑"/>
+          <w:sz w:val="20"/>
+        </w:rPr>
+        <w:t>说明：验证码存于内存字典，进程重启后失效。生产环境如需持久化可改用 Redis。</w:t>
+      </w:r>
+    </w:p>
+    <w:p>
+      <w:pPr>
+        <w:pStyle w:val="Heading1"/>
+      </w:pPr>
+      <w:r>
+        <w:rPr>
+          <w:rFonts w:ascii="微软雅黑" w:hAnsi="微软雅黑"/>
+          <w:b/>
+          <w:color w:val="1F3864"/>
+          <w:sz w:val="32"/>
+        </w:rPr>
+        <w:t>十二、文件上传接口（upload.py）</w:t>
+      </w:r>
+    </w:p>
+    <w:p>
+      <w:r>
+        <w:rPr>
+          <w:rFonts w:ascii="微软雅黑" w:hAnsi="微软雅黑"/>
+          <w:sz w:val="20"/>
+        </w:rPr>
+        <w:t>接收用户上传的文件，存储到服务器本地 uploads/ 目录，返回可访问的 URL 路径。</w:t>
+      </w:r>
+    </w:p>
+    <w:p>
+      <w:pPr>
+        <w:pStyle w:val="Heading2"/>
+      </w:pPr>
+      <w:r>
+        <w:rPr>
+          <w:rFonts w:ascii="微软雅黑" w:hAnsi="微软雅黑"/>
+          <w:b/>
+          <w:color w:val="2E75B6"/>
+          <w:sz w:val="26"/>
+        </w:rPr>
+        <w:t>核心逻辑</w:t>
+      </w:r>
+    </w:p>
+    <w:p>
+      <w:pPr>
+        <w:ind w:left="240"/>
+        <w:shd w:val="clear" w:color="auto" w:fill="F2F2F2"/>
+      </w:pPr>
+      <w:r>
+        <w:rPr>
+          <w:rFonts w:ascii="Courier New" w:hAnsi="Courier New"/>
+          <w:sz w:val="18"/>
+        </w:rPr>
+        <w:t>ALLOWED_TYPES = {</w:t>
+        <w:br/>
+        <w:t xml:space="preserve">    "application/pdf": ".pdf",</w:t>
+        <w:br/>
+        <w:t xml:space="preserve">    "image/jpeg": ".jpg",</w:t>
+        <w:br/>
+        <w:t xml:space="preserve">    "image/png": ".png",</w:t>
+        <w:br/>
+        <w:t xml:space="preserve">    "text/plain": ".txt",</w:t>
+        <w:br/>
+        <w:t xml:space="preserve">    "application/zip": ".zip",</w:t>
+        <w:br/>
+        <w:t>}</w:t>
+        <w:br/>
+        <w:t>MAX_SIZE_MB = 50</w:t>
+        <w:br/>
+        <w:br/>
+        <w:t>filename = f"{uuid.uuid4().hex}{ext}"   # UUID 文件名，防止路径冲突和原始文件名注入</w:t>
+        <w:br/>
+        <w:t>return {"url": f"/uploads/{filename}", "filename": file.filename, "size": len(data)}</w:t>
+      </w:r>
+    </w:p>
+    <w:p>
+      <w:pPr>
+        <w:shd w:val="clear" w:color="auto" w:fill="EBF3FB"/>
+      </w:pPr>
+      <w:r>
+        <w:rPr>
+          <w:rFonts w:ascii="微软雅黑" w:hAnsi="微软雅黑"/>
+          <w:sz w:val="20"/>
+        </w:rPr>
+        <w:t>说明：nginx 配置了 /uploads/ location 的 alias，直接由 nginx 静态服务文件，不经过 FastAPI，降低 I/O 开销。文件名使用 UUID 生成，防止路径遍历和同名覆盖。</w:t>
+      </w:r>
+    </w:p>
+    <w:p>
+      <w:pPr>
+        <w:pStyle w:val="Heading1"/>
+      </w:pPr>
+      <w:r>
+        <w:rPr>
+          <w:rFonts w:ascii="微软雅黑" w:hAnsi="微软雅黑"/>
+          <w:b/>
+          <w:color w:val="1F3864"/>
+          <w:sz w:val="32"/>
+        </w:rPr>
+        <w:t>十三、社区帖子列表页（CommunityPage.tsx）</w:t>
+      </w:r>
+    </w:p>
+    <w:p>
+      <w:r>
+        <w:rPr>
+          <w:rFonts w:ascii="微软雅黑" w:hAnsi="微软雅黑"/>
+          <w:sz w:val="20"/>
+        </w:rPr>
+        <w:t>展示帖子列表、筛选排序，以及发帖弹窗（含文件上传功能）。</w:t>
+      </w:r>
+    </w:p>
+    <w:p>
+      <w:pPr>
+        <w:pStyle w:val="Heading2"/>
+      </w:pPr>
+      <w:r>
+        <w:rPr>
+          <w:rFonts w:ascii="微软雅黑" w:hAnsi="微软雅黑"/>
+          <w:b/>
+          <w:color w:val="2E75B6"/>
+          <w:sz w:val="26"/>
+        </w:rPr>
+        <w:t>核心状态</w:t>
+      </w:r>
+    </w:p>
+    <w:p>
+      <w:pPr>
+        <w:ind w:left="240"/>
+        <w:shd w:val="clear" w:color="auto" w:fill="F2F2F2"/>
+      </w:pPr>
+      <w:r>
+        <w:rPr>
+          <w:rFonts w:ascii="Courier New" w:hAnsi="Courier New"/>
+          <w:sz w:val="18"/>
+        </w:rPr>
+        <w:t>const [posts, setPosts] = useState&lt;PostListItem[]&gt;([]);</w:t>
+        <w:br/>
+        <w:t>const [sort, setSort] = useState&lt;"new" | "hot"&gt;("new");   // 排序方式</w:t>
+        <w:br/>
+        <w:t>const [filterTag, setFilterTag] = useState&lt;string&gt;();     // 课程标签筛选</w:t>
+        <w:br/>
+        <w:t>const [shareMode, setShareMode] = useState&lt;"url" | "file"&gt;("url");  // 分享资源模式</w:t>
+        <w:br/>
+        <w:t>const [uploadedUrl, setUploadedUrl] = useState&lt;string&gt;(); // 文件上传后返回的路径</w:t>
+      </w:r>
+    </w:p>
+    <w:p>
+      <w:pPr>
+        <w:pStyle w:val="Heading2"/>
+      </w:pPr>
+      <w:r>
+        <w:rPr>
+          <w:rFonts w:ascii="微软雅黑" w:hAnsi="微软雅黑"/>
+          <w:b/>
+          <w:color w:val="2E75B6"/>
+          <w:sz w:val="26"/>
+        </w:rPr>
+        <w:t>文件上传实现</w:t>
+      </w:r>
+    </w:p>
+    <w:p>
+      <w:r>
+        <w:rPr>
+          <w:rFonts w:ascii="微软雅黑" w:hAnsi="微软雅黑"/>
+          <w:sz w:val="20"/>
+        </w:rPr>
+        <w:t>Ant Design Upload 组件使用 customRequest 属性，绕过默认上传行为，手动调用 communityApi.uploadFile() 发送到后端，获取返回的 URL 后存入 uploadedUrl 状态，发帖时作为 share_url 字段提交。</w:t>
+      </w:r>
+    </w:p>
+    <w:p>
+      <w:pPr>
+        <w:shd w:val="clear" w:color="auto" w:fill="EBF3FB"/>
+      </w:pPr>
+      <w:r>
+        <w:rPr>
+          <w:rFonts w:ascii="微软雅黑" w:hAnsi="微软雅黑"/>
+          <w:sz w:val="20"/>
+        </w:rPr>
+        <w:t>说明：shareMode 状态通过 Tabs 切换控制，url 模式下提交 Form 字段 share_url，file 模式下提交 uploadedUrl，两者互斥。</w:t>
+      </w:r>
+    </w:p>
+    <w:p>
+      <w:pPr>
+        <w:pStyle w:val="Heading1"/>
+      </w:pPr>
+      <w:r>
+        <w:rPr>
+          <w:rFonts w:ascii="微软雅黑" w:hAnsi="微软雅黑"/>
+          <w:b/>
+          <w:color w:val="1F3864"/>
+          <w:sz w:val="32"/>
+        </w:rPr>
+        <w:t>十四、帖子详情页（PostDetailPage.tsx）</w:t>
+      </w:r>
+    </w:p>
+    <w:p>
+      <w:r>
+        <w:rPr>
+          <w:rFonts w:ascii="微软雅黑" w:hAnsi="微软雅黑"/>
+          <w:sz w:val="20"/>
+        </w:rPr>
+        <w:t>展示帖子内容、嵌套评论树、分享资源预览，以及评论输入框（支持@回复和@AI助手）。</w:t>
+      </w:r>
+    </w:p>
+    <w:p>
+      <w:pPr>
+        <w:pStyle w:val="Heading2"/>
+      </w:pPr>
+      <w:r>
+        <w:rPr>
+          <w:rFonts w:ascii="微软雅黑" w:hAnsi="微软雅黑"/>
+          <w:b/>
+          <w:color w:val="2E75B6"/>
+          <w:sz w:val="26"/>
+        </w:rPr>
+        <w:t>嵌套评论渲染</w:t>
+      </w:r>
+    </w:p>
+    <w:p>
+      <w:pPr>
+        <w:ind w:left="240"/>
+        <w:shd w:val="clear" w:color="auto" w:fill="F2F2F2"/>
+      </w:pPr>
+      <w:r>
+        <w:rPr>
+          <w:rFonts w:ascii="Courier New" w:hAnsi="Courier New"/>
+          <w:sz w:val="18"/>
+        </w:rPr>
+        <w:t>// CommentCard 递归组件</w:t>
+        <w:br/>
+        <w:t>const CommentCard: React.FC&lt;{ comment: CommentOut; depth?: number }&gt; = ({ comment, depth = 0 }) =&gt; (</w:t>
+        <w:br/>
+        <w:t xml:space="preserve">  &lt;div style={{ marginLeft: depth &gt; 0 ? 24 : 0 }}&gt;</w:t>
+        <w:br/>
+        <w:t xml:space="preserve">    &lt;Card&gt;...&lt;/Card&gt;</w:t>
+        <w:br/>
+        <w:t xml:space="preserve">    {comment.replies.map(reply =&gt; (</w:t>
+        <w:br/>
+        <w:t xml:space="preserve">      &lt;CommentCard key={reply.id} comment={reply} depth={depth + 1} /&gt;</w:t>
+        <w:br/>
+        <w:t xml:space="preserve">    ))}</w:t>
+        <w:br/>
+        <w:t xml:space="preserve">  &lt;/div&gt;</w:t>
+        <w:br/>
+        <w:t>);</w:t>
+      </w:r>
+    </w:p>
+    <w:p>
+      <w:pPr>
+        <w:pStyle w:val="Heading2"/>
+      </w:pPr>
+      <w:r>
+        <w:rPr>
+          <w:rFonts w:ascii="微软雅黑" w:hAnsi="微软雅黑"/>
+          <w:b/>
+          <w:color w:val="2E75B6"/>
+          <w:sz w:val="26"/>
+        </w:rPr>
+        <w:t>AI 回复样式区分</w:t>
+      </w:r>
+    </w:p>
+    <w:p>
+      <w:r>
+        <w:rPr>
+          <w:rFonts w:ascii="微软雅黑" w:hAnsi="微软雅黑"/>
+          <w:sz w:val="20"/>
+        </w:rPr>
+        <w:t>is_ai=true 的评论使用紫色边框（rgba(139,92,246,0.35)）和深紫背景，头像图标为 RobotOutlined，内容用 ReactMarkdown 渲染。普通用户评论使用蓝色边框，内容为纯文本。</w:t>
+      </w:r>
+    </w:p>
+    <w:p>
+      <w:pPr>
+        <w:pStyle w:val="Heading2"/>
+      </w:pPr>
+      <w:r>
+        <w:rPr>
+          <w:rFonts w:ascii="微软雅黑" w:hAnsi="微软雅黑"/>
+          <w:b/>
+          <w:color w:val="2E75B6"/>
+          <w:sz w:val="26"/>
+        </w:rPr>
+        <w:t>资源附件显示</w:t>
+      </w:r>
+    </w:p>
+    <w:p>
+      <w:r>
+        <w:rPr>
+          <w:rFonts w:ascii="微软雅黑" w:hAnsi="微软雅黑"/>
+          <w:sz w:val="20"/>
+        </w:rPr>
+        <w:t>share_url 以 /uploads 开头时显示"下载"按钮（DownloadOutlined）并设置 download 属性；以 http 开头时显示"访问链接"按钮（LinkOutlined），target="_blank" 新标签页打开。</w:t>
+      </w:r>
+    </w:p>
+    <w:p>
+      <w:pPr>
+        <w:shd w:val="clear" w:color="auto" w:fill="EBF3FB"/>
+      </w:pPr>
+      <w:r>
+        <w:rPr>
+          <w:rFonts w:ascii="微软雅黑" w:hAnsi="微软雅黑"/>
+          <w:sz w:val="20"/>
+        </w:rPr>
+        <w:t>说明：@AI助手 按钮调用 handleAtAI()，将 "@AI助手 " 预填入评论框并聚焦，降低用户触发 AI 的操作成本。</w:t>
+      </w:r>
+    </w:p>
     <w:sectPr>
       <w:pgSz w:w="12240" w:h="15840"/>
       <w:pgMar w:top="1440" w:right="1728" w:bottom="1440" w:left="1728" w:header="720" w:footer="720" w:gutter="0"/>

</xml_diff>